<commit_message>
updated qmd with new plot for sites
</commit_message>
<xml_diff>
--- a/PCORI_QPR.docx
+++ b/PCORI_QPR.docx
@@ -2957,7 +2957,7 @@
     </w:p>
     <w:bookmarkEnd w:id="29"/>
     <w:bookmarkEnd w:id="30"/>
-    <w:bookmarkStart w:id="33" w:name="discussion"/>
+    <w:bookmarkStart w:id="37" w:name="discussion"/>
     <w:p>
       <w:pPr>
         <w:pStyle w:val="Heading2"/>
@@ -3058,7 +3058,2328 @@
       </w:r>
     </w:p>
     <w:bookmarkEnd w:id="32"/>
-    <w:bookmarkEnd w:id="33"/>
+    <w:bookmarkStart w:id="36" w:name="site-counts-of-asuc-patients-in-2024"/>
+    <w:p>
+      <w:pPr>
+        <w:pStyle w:val="Heading3"/>
+      </w:pPr>
+      <w:r>
+        <w:t xml:space="preserve">Site Counts of ASUC Patients in 2024</w:t>
+      </w:r>
+    </w:p>
+    <w:p>
+      <w:pPr>
+        <w:pStyle w:val="SourceCode"/>
+      </w:pPr>
+      <w:r>
+        <w:rPr>
+          <w:rStyle w:val="FunctionTok"/>
+        </w:rPr>
+        <w:t xml:space="preserve">library</w:t>
+      </w:r>
+      <w:r>
+        <w:rPr>
+          <w:rStyle w:val="NormalTok"/>
+        </w:rPr>
+        <w:t xml:space="preserve">(tidyverse)</w:t>
+      </w:r>
+      <w:r>
+        <w:br/>
+      </w:r>
+      <w:r>
+        <w:rPr>
+          <w:rStyle w:val="FunctionTok"/>
+        </w:rPr>
+        <w:t xml:space="preserve">library</w:t>
+      </w:r>
+      <w:r>
+        <w:rPr>
+          <w:rStyle w:val="NormalTok"/>
+        </w:rPr>
+        <w:t xml:space="preserve">(janitor)</w:t>
+      </w:r>
+    </w:p>
+    <w:p>
+      <w:pPr>
+        <w:pStyle w:val="SourceCode"/>
+      </w:pPr>
+      <w:r>
+        <w:br/>
+      </w:r>
+      <w:r>
+        <w:rPr>
+          <w:rStyle w:val="VerbatimChar"/>
+        </w:rPr>
+        <w:t xml:space="preserve">Attaching package: 'janitor'</w:t>
+      </w:r>
+    </w:p>
+    <w:p>
+      <w:pPr>
+        <w:pStyle w:val="SourceCode"/>
+      </w:pPr>
+      <w:r>
+        <w:rPr>
+          <w:rStyle w:val="VerbatimChar"/>
+        </w:rPr>
+        <w:t xml:space="preserve">The following objects are masked from 'package:stats':</w:t>
+      </w:r>
+      <w:r>
+        <w:br/>
+      </w:r>
+      <w:r>
+        <w:br/>
+      </w:r>
+      <w:r>
+        <w:rPr>
+          <w:rStyle w:val="VerbatimChar"/>
+        </w:rPr>
+        <w:t xml:space="preserve">    chisq.test, fisher.test</w:t>
+      </w:r>
+    </w:p>
+    <w:p>
+      <w:pPr>
+        <w:pStyle w:val="SourceCode"/>
+      </w:pPr>
+      <w:r>
+        <w:rPr>
+          <w:rStyle w:val="FunctionTok"/>
+        </w:rPr>
+        <w:t xml:space="preserve">library</w:t>
+      </w:r>
+      <w:r>
+        <w:rPr>
+          <w:rStyle w:val="NormalTok"/>
+        </w:rPr>
+        <w:t xml:space="preserve">(readxl)</w:t>
+      </w:r>
+      <w:r>
+        <w:br/>
+      </w:r>
+      <w:r>
+        <w:br/>
+      </w:r>
+      <w:r>
+        <w:rPr>
+          <w:rStyle w:val="NormalTok"/>
+        </w:rPr>
+        <w:t xml:space="preserve">ann_dat</w:t>
+      </w:r>
+      <w:r>
+        <w:rPr>
+          <w:rStyle w:val="OtherTok"/>
+        </w:rPr>
+        <w:t xml:space="preserve">&lt;-</w:t>
+      </w:r>
+      <w:r>
+        <w:rPr>
+          <w:rStyle w:val="NormalTok"/>
+        </w:rPr>
+        <w:t xml:space="preserve"> </w:t>
+      </w:r>
+      <w:r>
+        <w:rPr>
+          <w:rStyle w:val="FunctionTok"/>
+        </w:rPr>
+        <w:t xml:space="preserve">read_xlsx</w:t>
+      </w:r>
+      <w:r>
+        <w:rPr>
+          <w:rStyle w:val="NormalTok"/>
+        </w:rPr>
+        <w:t xml:space="preserve">(</w:t>
+      </w:r>
+      <w:r>
+        <w:rPr>
+          <w:rStyle w:val="StringTok"/>
+        </w:rPr>
+        <w:t xml:space="preserve">"fd2396_ASUC_final_report.xlsx"</w:t>
+      </w:r>
+      <w:r>
+        <w:rPr>
+          <w:rStyle w:val="NormalTok"/>
+        </w:rPr>
+        <w:t xml:space="preserve">, </w:t>
+      </w:r>
+      <w:r>
+        <w:rPr>
+          <w:rStyle w:val="AttributeTok"/>
+        </w:rPr>
+        <w:t xml:space="preserve">sheet =</w:t>
+      </w:r>
+      <w:r>
+        <w:rPr>
+          <w:rStyle w:val="NormalTok"/>
+        </w:rPr>
+        <w:t xml:space="preserve"> </w:t>
+      </w:r>
+      <w:r>
+        <w:rPr>
+          <w:rStyle w:val="StringTok"/>
+        </w:rPr>
+        <w:t xml:space="preserve">"Table_1.A"</w:t>
+      </w:r>
+      <w:r>
+        <w:rPr>
+          <w:rStyle w:val="NormalTok"/>
+        </w:rPr>
+        <w:t xml:space="preserve">,  </w:t>
+      </w:r>
+      <w:r>
+        <w:rPr>
+          <w:rStyle w:val="AttributeTok"/>
+        </w:rPr>
+        <w:t xml:space="preserve">skip =</w:t>
+      </w:r>
+      <w:r>
+        <w:rPr>
+          <w:rStyle w:val="DecValTok"/>
+        </w:rPr>
+        <w:t xml:space="preserve">7</w:t>
+      </w:r>
+      <w:r>
+        <w:rPr>
+          <w:rStyle w:val="NormalTok"/>
+        </w:rPr>
+        <w:t xml:space="preserve">) </w:t>
+      </w:r>
+      <w:r>
+        <w:rPr>
+          <w:rStyle w:val="SpecialCharTok"/>
+        </w:rPr>
+        <w:t xml:space="preserve">|&gt;</w:t>
+      </w:r>
+      <w:r>
+        <w:br/>
+      </w:r>
+      <w:r>
+        <w:rPr>
+          <w:rStyle w:val="NormalTok"/>
+        </w:rPr>
+        <w:t xml:space="preserve">  </w:t>
+      </w:r>
+      <w:r>
+        <w:rPr>
+          <w:rStyle w:val="FunctionTok"/>
+        </w:rPr>
+        <w:t xml:space="preserve">select</w:t>
+      </w:r>
+      <w:r>
+        <w:rPr>
+          <w:rStyle w:val="NormalTok"/>
+        </w:rPr>
+        <w:t xml:space="preserve">(Characteristics, </w:t>
+      </w:r>
+      <w:r>
+        <w:rPr>
+          <w:rStyle w:val="StringTok"/>
+        </w:rPr>
+        <w:t xml:space="preserve">`</w:t>
+      </w:r>
+      <w:r>
+        <w:rPr>
+          <w:rStyle w:val="AttributeTok"/>
+        </w:rPr>
+        <w:t xml:space="preserve">26</w:t>
+      </w:r>
+      <w:r>
+        <w:rPr>
+          <w:rStyle w:val="StringTok"/>
+        </w:rPr>
+        <w:t xml:space="preserve">`</w:t>
+      </w:r>
+      <w:r>
+        <w:rPr>
+          <w:rStyle w:val="NormalTok"/>
+        </w:rPr>
+        <w:t xml:space="preserve">, </w:t>
+      </w:r>
+      <w:r>
+        <w:rPr>
+          <w:rStyle w:val="FunctionTok"/>
+        </w:rPr>
+        <w:t xml:space="preserve">ends_with</w:t>
+      </w:r>
+      <w:r>
+        <w:rPr>
+          <w:rStyle w:val="NormalTok"/>
+        </w:rPr>
+        <w:t xml:space="preserve">(</w:t>
+      </w:r>
+      <w:r>
+        <w:rPr>
+          <w:rStyle w:val="StringTok"/>
+        </w:rPr>
+        <w:t xml:space="preserve">"Mean"</w:t>
+      </w:r>
+      <w:r>
+        <w:rPr>
+          <w:rStyle w:val="NormalTok"/>
+        </w:rPr>
+        <w:t xml:space="preserve">)) </w:t>
+      </w:r>
+      <w:r>
+        <w:rPr>
+          <w:rStyle w:val="SpecialCharTok"/>
+        </w:rPr>
+        <w:t xml:space="preserve">|&gt;</w:t>
+      </w:r>
+      <w:r>
+        <w:br/>
+      </w:r>
+      <w:r>
+        <w:rPr>
+          <w:rStyle w:val="NormalTok"/>
+        </w:rPr>
+        <w:t xml:space="preserve">  </w:t>
+      </w:r>
+      <w:r>
+        <w:rPr>
+          <w:rStyle w:val="FunctionTok"/>
+        </w:rPr>
+        <w:t xml:space="preserve">select</w:t>
+      </w:r>
+      <w:r>
+        <w:rPr>
+          <w:rStyle w:val="NormalTok"/>
+        </w:rPr>
+        <w:t xml:space="preserve">(</w:t>
+      </w:r>
+      <w:r>
+        <w:rPr>
+          <w:rStyle w:val="SpecialCharTok"/>
+        </w:rPr>
+        <w:t xml:space="preserve">-</w:t>
+      </w:r>
+      <w:r>
+        <w:rPr>
+          <w:rStyle w:val="DecValTok"/>
+        </w:rPr>
+        <w:t xml:space="preserve">3</w:t>
+      </w:r>
+      <w:r>
+        <w:rPr>
+          <w:rStyle w:val="NormalTok"/>
+        </w:rPr>
+        <w:t xml:space="preserve"> ) </w:t>
+      </w:r>
+      <w:r>
+        <w:rPr>
+          <w:rStyle w:val="SpecialCharTok"/>
+        </w:rPr>
+        <w:t xml:space="preserve">|&gt;</w:t>
+      </w:r>
+      <w:r>
+        <w:br/>
+      </w:r>
+      <w:r>
+        <w:rPr>
+          <w:rStyle w:val="NormalTok"/>
+        </w:rPr>
+        <w:t xml:space="preserve">  </w:t>
+      </w:r>
+      <w:r>
+        <w:rPr>
+          <w:rStyle w:val="FunctionTok"/>
+        </w:rPr>
+        <w:t xml:space="preserve">slice</w:t>
+      </w:r>
+      <w:r>
+        <w:rPr>
+          <w:rStyle w:val="NormalTok"/>
+        </w:rPr>
+        <w:t xml:space="preserve">(</w:t>
+      </w:r>
+      <w:r>
+        <w:rPr>
+          <w:rStyle w:val="DecValTok"/>
+        </w:rPr>
+        <w:t xml:space="preserve">2</w:t>
+      </w:r>
+      <w:r>
+        <w:rPr>
+          <w:rStyle w:val="SpecialCharTok"/>
+        </w:rPr>
+        <w:t xml:space="preserve">:</w:t>
+      </w:r>
+      <w:r>
+        <w:rPr>
+          <w:rStyle w:val="DecValTok"/>
+        </w:rPr>
+        <w:t xml:space="preserve">76</w:t>
+      </w:r>
+      <w:r>
+        <w:rPr>
+          <w:rStyle w:val="NormalTok"/>
+        </w:rPr>
+        <w:t xml:space="preserve">) </w:t>
+      </w:r>
+      <w:r>
+        <w:rPr>
+          <w:rStyle w:val="SpecialCharTok"/>
+        </w:rPr>
+        <w:t xml:space="preserve">|&gt;</w:t>
+      </w:r>
+      <w:r>
+        <w:br/>
+      </w:r>
+      <w:r>
+        <w:rPr>
+          <w:rStyle w:val="NormalTok"/>
+        </w:rPr>
+        <w:t xml:space="preserve">  </w:t>
+      </w:r>
+      <w:r>
+        <w:rPr>
+          <w:rStyle w:val="FunctionTok"/>
+        </w:rPr>
+        <w:t xml:space="preserve">rename</w:t>
+      </w:r>
+      <w:r>
+        <w:rPr>
+          <w:rStyle w:val="NormalTok"/>
+        </w:rPr>
+        <w:t xml:space="preserve">(</w:t>
+      </w:r>
+      <w:r>
+        <w:rPr>
+          <w:rStyle w:val="StringTok"/>
+        </w:rPr>
+        <w:t xml:space="preserve">"DataMart 01"</w:t>
+      </w:r>
+      <w:r>
+        <w:rPr>
+          <w:rStyle w:val="NormalTok"/>
+        </w:rPr>
+        <w:t xml:space="preserve"> </w:t>
+      </w:r>
+      <w:r>
+        <w:rPr>
+          <w:rStyle w:val="OtherTok"/>
+        </w:rPr>
+        <w:t xml:space="preserve">=</w:t>
+      </w:r>
+      <w:r>
+        <w:rPr>
+          <w:rStyle w:val="NormalTok"/>
+        </w:rPr>
+        <w:t xml:space="preserve"> </w:t>
+      </w:r>
+      <w:r>
+        <w:rPr>
+          <w:rStyle w:val="StringTok"/>
+        </w:rPr>
+        <w:t xml:space="preserve">`</w:t>
+      </w:r>
+      <w:r>
+        <w:rPr>
+          <w:rStyle w:val="AttributeTok"/>
+        </w:rPr>
+        <w:t xml:space="preserve">26</w:t>
+      </w:r>
+      <w:r>
+        <w:rPr>
+          <w:rStyle w:val="StringTok"/>
+        </w:rPr>
+        <w:t xml:space="preserve">`</w:t>
+      </w:r>
+      <w:r>
+        <w:rPr>
+          <w:rStyle w:val="NormalTok"/>
+        </w:rPr>
+        <w:t xml:space="preserve">)</w:t>
+      </w:r>
+    </w:p>
+    <w:p>
+      <w:pPr>
+        <w:pStyle w:val="SourceCode"/>
+      </w:pPr>
+      <w:r>
+        <w:rPr>
+          <w:rStyle w:val="VerbatimChar"/>
+        </w:rPr>
+        <w:t xml:space="preserve">New names:</w:t>
+      </w:r>
+      <w:r>
+        <w:br/>
+      </w:r>
+      <w:r>
+        <w:rPr>
+          <w:rStyle w:val="VerbatimChar"/>
+        </w:rPr>
+        <w:t xml:space="preserve">• `` -&gt; `...128`</w:t>
+      </w:r>
+    </w:p>
+    <w:p>
+      <w:pPr>
+        <w:pStyle w:val="SourceCode"/>
+      </w:pPr>
+      <w:r>
+        <w:rPr>
+          <w:rStyle w:val="FunctionTok"/>
+        </w:rPr>
+        <w:t xml:space="preserve">names</w:t>
+      </w:r>
+      <w:r>
+        <w:rPr>
+          <w:rStyle w:val="NormalTok"/>
+        </w:rPr>
+        <w:t xml:space="preserve">(ann_dat) </w:t>
+      </w:r>
+      <w:r>
+        <w:rPr>
+          <w:rStyle w:val="OtherTok"/>
+        </w:rPr>
+        <w:t xml:space="preserve">&lt;-</w:t>
+      </w:r>
+      <w:r>
+        <w:rPr>
+          <w:rStyle w:val="NormalTok"/>
+        </w:rPr>
+        <w:t xml:space="preserve"> </w:t>
+      </w:r>
+      <w:r>
+        <w:rPr>
+          <w:rStyle w:val="FunctionTok"/>
+        </w:rPr>
+        <w:t xml:space="preserve">str_sub</w:t>
+      </w:r>
+      <w:r>
+        <w:rPr>
+          <w:rStyle w:val="NormalTok"/>
+        </w:rPr>
+        <w:t xml:space="preserve">(</w:t>
+      </w:r>
+      <w:r>
+        <w:rPr>
+          <w:rStyle w:val="FunctionTok"/>
+        </w:rPr>
+        <w:t xml:space="preserve">names</w:t>
+      </w:r>
+      <w:r>
+        <w:rPr>
+          <w:rStyle w:val="NormalTok"/>
+        </w:rPr>
+        <w:t xml:space="preserve">(ann_dat), </w:t>
+      </w:r>
+      <w:r>
+        <w:rPr>
+          <w:rStyle w:val="AttributeTok"/>
+        </w:rPr>
+        <w:t xml:space="preserve">start =</w:t>
+      </w:r>
+      <w:r>
+        <w:rPr>
+          <w:rStyle w:val="NormalTok"/>
+        </w:rPr>
+        <w:t xml:space="preserve"> </w:t>
+      </w:r>
+      <w:r>
+        <w:rPr>
+          <w:rStyle w:val="DecValTok"/>
+        </w:rPr>
+        <w:t xml:space="preserve">1</w:t>
+      </w:r>
+      <w:r>
+        <w:rPr>
+          <w:rStyle w:val="NormalTok"/>
+        </w:rPr>
+        <w:t xml:space="preserve">L, </w:t>
+      </w:r>
+      <w:r>
+        <w:rPr>
+          <w:rStyle w:val="AttributeTok"/>
+        </w:rPr>
+        <w:t xml:space="preserve">end =</w:t>
+      </w:r>
+      <w:r>
+        <w:rPr>
+          <w:rStyle w:val="NormalTok"/>
+        </w:rPr>
+        <w:t xml:space="preserve"> </w:t>
+      </w:r>
+      <w:r>
+        <w:rPr>
+          <w:rStyle w:val="DecValTok"/>
+        </w:rPr>
+        <w:t xml:space="preserve">11</w:t>
+      </w:r>
+      <w:r>
+        <w:rPr>
+          <w:rStyle w:val="NormalTok"/>
+        </w:rPr>
+        <w:t xml:space="preserve">L)</w:t>
+      </w:r>
+      <w:r>
+        <w:br/>
+      </w:r>
+      <w:r>
+        <w:br/>
+      </w:r>
+      <w:r>
+        <w:rPr>
+          <w:rStyle w:val="NormalTok"/>
+        </w:rPr>
+        <w:t xml:space="preserve">crosswalk </w:t>
+      </w:r>
+      <w:r>
+        <w:rPr>
+          <w:rStyle w:val="OtherTok"/>
+        </w:rPr>
+        <w:t xml:space="preserve">&lt;-</w:t>
+      </w:r>
+      <w:r>
+        <w:rPr>
+          <w:rStyle w:val="NormalTok"/>
+        </w:rPr>
+        <w:t xml:space="preserve"> </w:t>
+      </w:r>
+      <w:r>
+        <w:rPr>
+          <w:rStyle w:val="FunctionTok"/>
+        </w:rPr>
+        <w:t xml:space="preserve">read_xlsx</w:t>
+      </w:r>
+      <w:r>
+        <w:rPr>
+          <w:rStyle w:val="NormalTok"/>
+        </w:rPr>
+        <w:t xml:space="preserve">(</w:t>
+      </w:r>
+      <w:r>
+        <w:rPr>
+          <w:rStyle w:val="StringTok"/>
+        </w:rPr>
+        <w:t xml:space="preserve">"FD2396_anonymous_datamart_id_crosswalk.xlsx"</w:t>
+      </w:r>
+      <w:r>
+        <w:rPr>
+          <w:rStyle w:val="NormalTok"/>
+        </w:rPr>
+        <w:t xml:space="preserve">) </w:t>
+      </w:r>
+      <w:r>
+        <w:rPr>
+          <w:rStyle w:val="SpecialCharTok"/>
+        </w:rPr>
+        <w:t xml:space="preserve">%&gt;%</w:t>
+      </w:r>
+      <w:r>
+        <w:br/>
+      </w:r>
+      <w:r>
+        <w:rPr>
+          <w:rStyle w:val="NormalTok"/>
+        </w:rPr>
+        <w:t xml:space="preserve">  </w:t>
+      </w:r>
+      <w:r>
+        <w:rPr>
+          <w:rStyle w:val="FunctionTok"/>
+        </w:rPr>
+        <w:t xml:space="preserve">clean_names</w:t>
+      </w:r>
+      <w:r>
+        <w:rPr>
+          <w:rStyle w:val="NormalTok"/>
+        </w:rPr>
+        <w:t xml:space="preserve">() </w:t>
+      </w:r>
+      <w:r>
+        <w:rPr>
+          <w:rStyle w:val="SpecialCharTok"/>
+        </w:rPr>
+        <w:t xml:space="preserve">%&gt;%</w:t>
+      </w:r>
+      <w:r>
+        <w:br/>
+      </w:r>
+      <w:r>
+        <w:rPr>
+          <w:rStyle w:val="NormalTok"/>
+        </w:rPr>
+        <w:t xml:space="preserve">  </w:t>
+      </w:r>
+      <w:r>
+        <w:rPr>
+          <w:rStyle w:val="FunctionTok"/>
+        </w:rPr>
+        <w:t xml:space="preserve">select</w:t>
+      </w:r>
+      <w:r>
+        <w:rPr>
+          <w:rStyle w:val="NormalTok"/>
+        </w:rPr>
+        <w:t xml:space="preserve">(</w:t>
+      </w:r>
+      <w:r>
+        <w:rPr>
+          <w:rStyle w:val="DecValTok"/>
+        </w:rPr>
+        <w:t xml:space="preserve">2</w:t>
+      </w:r>
+      <w:r>
+        <w:rPr>
+          <w:rStyle w:val="NormalTok"/>
+        </w:rPr>
+        <w:t xml:space="preserve">,</w:t>
+      </w:r>
+      <w:r>
+        <w:rPr>
+          <w:rStyle w:val="DecValTok"/>
+        </w:rPr>
+        <w:t xml:space="preserve">5</w:t>
+      </w:r>
+      <w:r>
+        <w:rPr>
+          <w:rStyle w:val="NormalTok"/>
+        </w:rPr>
+        <w:t xml:space="preserve">,</w:t>
+      </w:r>
+      <w:r>
+        <w:rPr>
+          <w:rStyle w:val="DecValTok"/>
+        </w:rPr>
+        <w:t xml:space="preserve">7</w:t>
+      </w:r>
+      <w:r>
+        <w:rPr>
+          <w:rStyle w:val="NormalTok"/>
+        </w:rPr>
+        <w:t xml:space="preserve">) </w:t>
+      </w:r>
+      <w:r>
+        <w:rPr>
+          <w:rStyle w:val="SpecialCharTok"/>
+        </w:rPr>
+        <w:t xml:space="preserve">%&gt;%</w:t>
+      </w:r>
+      <w:r>
+        <w:br/>
+      </w:r>
+      <w:r>
+        <w:rPr>
+          <w:rStyle w:val="NormalTok"/>
+        </w:rPr>
+        <w:t xml:space="preserve">  </w:t>
+      </w:r>
+      <w:r>
+        <w:rPr>
+          <w:rStyle w:val="FunctionTok"/>
+        </w:rPr>
+        <w:t xml:space="preserve">rename</w:t>
+      </w:r>
+      <w:r>
+        <w:rPr>
+          <w:rStyle w:val="NormalTok"/>
+        </w:rPr>
+        <w:t xml:space="preserve">(</w:t>
+      </w:r>
+      <w:r>
+        <w:rPr>
+          <w:rStyle w:val="AttributeTok"/>
+        </w:rPr>
+        <w:t xml:space="preserve">datamart =</w:t>
+      </w:r>
+      <w:r>
+        <w:rPr>
+          <w:rStyle w:val="NormalTok"/>
+        </w:rPr>
+        <w:t xml:space="preserve"> anonymous_datamart_id,</w:t>
+      </w:r>
+      <w:r>
+        <w:br/>
+      </w:r>
+      <w:r>
+        <w:rPr>
+          <w:rStyle w:val="NormalTok"/>
+        </w:rPr>
+        <w:t xml:space="preserve">         </w:t>
+      </w:r>
+      <w:r>
+        <w:rPr>
+          <w:rStyle w:val="AttributeTok"/>
+        </w:rPr>
+        <w:t xml:space="preserve">network =</w:t>
+      </w:r>
+      <w:r>
+        <w:rPr>
+          <w:rStyle w:val="NormalTok"/>
+        </w:rPr>
+        <w:t xml:space="preserve"> network_name,</w:t>
+      </w:r>
+      <w:r>
+        <w:br/>
+      </w:r>
+      <w:r>
+        <w:rPr>
+          <w:rStyle w:val="NormalTok"/>
+        </w:rPr>
+        <w:t xml:space="preserve">         </w:t>
+      </w:r>
+      <w:r>
+        <w:rPr>
+          <w:rStyle w:val="AttributeTok"/>
+        </w:rPr>
+        <w:t xml:space="preserve">site =</w:t>
+      </w:r>
+      <w:r>
+        <w:rPr>
+          <w:rStyle w:val="NormalTok"/>
+        </w:rPr>
+        <w:t xml:space="preserve"> datamart_name) </w:t>
+      </w:r>
+      <w:r>
+        <w:rPr>
+          <w:rStyle w:val="SpecialCharTok"/>
+        </w:rPr>
+        <w:t xml:space="preserve">|&gt;</w:t>
+      </w:r>
+      <w:r>
+        <w:br/>
+      </w:r>
+      <w:r>
+        <w:rPr>
+          <w:rStyle w:val="NormalTok"/>
+        </w:rPr>
+        <w:t xml:space="preserve">  </w:t>
+      </w:r>
+      <w:r>
+        <w:rPr>
+          <w:rStyle w:val="FunctionTok"/>
+        </w:rPr>
+        <w:t xml:space="preserve">slice</w:t>
+      </w:r>
+      <w:r>
+        <w:rPr>
+          <w:rStyle w:val="NormalTok"/>
+        </w:rPr>
+        <w:t xml:space="preserve">(</w:t>
+      </w:r>
+      <w:r>
+        <w:rPr>
+          <w:rStyle w:val="DecValTok"/>
+        </w:rPr>
+        <w:t xml:space="preserve">1</w:t>
+      </w:r>
+      <w:r>
+        <w:rPr>
+          <w:rStyle w:val="SpecialCharTok"/>
+        </w:rPr>
+        <w:t xml:space="preserve">:</w:t>
+      </w:r>
+      <w:r>
+        <w:rPr>
+          <w:rStyle w:val="DecValTok"/>
+        </w:rPr>
+        <w:t xml:space="preserve">62</w:t>
+      </w:r>
+      <w:r>
+        <w:rPr>
+          <w:rStyle w:val="NormalTok"/>
+        </w:rPr>
+        <w:t xml:space="preserve">) </w:t>
+      </w:r>
+      <w:r>
+        <w:rPr>
+          <w:rStyle w:val="SpecialCharTok"/>
+        </w:rPr>
+        <w:t xml:space="preserve">|&gt;</w:t>
+      </w:r>
+      <w:r>
+        <w:br/>
+      </w:r>
+      <w:r>
+        <w:rPr>
+          <w:rStyle w:val="NormalTok"/>
+        </w:rPr>
+        <w:t xml:space="preserve">  </w:t>
+      </w:r>
+      <w:r>
+        <w:rPr>
+          <w:rStyle w:val="FunctionTok"/>
+        </w:rPr>
+        <w:t xml:space="preserve">t</w:t>
+      </w:r>
+      <w:r>
+        <w:rPr>
+          <w:rStyle w:val="NormalTok"/>
+        </w:rPr>
+        <w:t xml:space="preserve">() </w:t>
+      </w:r>
+      <w:r>
+        <w:rPr>
+          <w:rStyle w:val="SpecialCharTok"/>
+        </w:rPr>
+        <w:t xml:space="preserve">|&gt;</w:t>
+      </w:r>
+      <w:r>
+        <w:br/>
+      </w:r>
+      <w:r>
+        <w:rPr>
+          <w:rStyle w:val="NormalTok"/>
+        </w:rPr>
+        <w:t xml:space="preserve">  </w:t>
+      </w:r>
+      <w:r>
+        <w:rPr>
+          <w:rStyle w:val="FunctionTok"/>
+        </w:rPr>
+        <w:t xml:space="preserve">as.data.frame</w:t>
+      </w:r>
+      <w:r>
+        <w:rPr>
+          <w:rStyle w:val="NormalTok"/>
+        </w:rPr>
+        <w:t xml:space="preserve">() </w:t>
+      </w:r>
+      <w:r>
+        <w:rPr>
+          <w:rStyle w:val="SpecialCharTok"/>
+        </w:rPr>
+        <w:t xml:space="preserve">|&gt;</w:t>
+      </w:r>
+      <w:r>
+        <w:br/>
+      </w:r>
+      <w:r>
+        <w:rPr>
+          <w:rStyle w:val="NormalTok"/>
+        </w:rPr>
+        <w:t xml:space="preserve">  </w:t>
+      </w:r>
+      <w:r>
+        <w:rPr>
+          <w:rStyle w:val="FunctionTok"/>
+        </w:rPr>
+        <w:t xml:space="preserve">rownames_to_column</w:t>
+      </w:r>
+      <w:r>
+        <w:rPr>
+          <w:rStyle w:val="NormalTok"/>
+        </w:rPr>
+        <w:t xml:space="preserve">(</w:t>
+      </w:r>
+      <w:r>
+        <w:rPr>
+          <w:rStyle w:val="StringTok"/>
+        </w:rPr>
+        <w:t xml:space="preserve">"Characteristics"</w:t>
+      </w:r>
+      <w:r>
+        <w:rPr>
+          <w:rStyle w:val="NormalTok"/>
+        </w:rPr>
+        <w:t xml:space="preserve">) </w:t>
+      </w:r>
+      <w:r>
+        <w:rPr>
+          <w:rStyle w:val="SpecialCharTok"/>
+        </w:rPr>
+        <w:t xml:space="preserve">|&gt;</w:t>
+      </w:r>
+      <w:r>
+        <w:br/>
+      </w:r>
+      <w:r>
+        <w:rPr>
+          <w:rStyle w:val="NormalTok"/>
+        </w:rPr>
+        <w:t xml:space="preserve">  </w:t>
+      </w:r>
+      <w:r>
+        <w:rPr>
+          <w:rStyle w:val="FunctionTok"/>
+        </w:rPr>
+        <w:t xml:space="preserve">row_to_names</w:t>
+      </w:r>
+      <w:r>
+        <w:rPr>
+          <w:rStyle w:val="NormalTok"/>
+        </w:rPr>
+        <w:t xml:space="preserve">(</w:t>
+      </w:r>
+      <w:r>
+        <w:rPr>
+          <w:rStyle w:val="AttributeTok"/>
+        </w:rPr>
+        <w:t xml:space="preserve">row_number =</w:t>
+      </w:r>
+      <w:r>
+        <w:rPr>
+          <w:rStyle w:val="NormalTok"/>
+        </w:rPr>
+        <w:t xml:space="preserve"> </w:t>
+      </w:r>
+      <w:r>
+        <w:rPr>
+          <w:rStyle w:val="DecValTok"/>
+        </w:rPr>
+        <w:t xml:space="preserve">1</w:t>
+      </w:r>
+      <w:r>
+        <w:rPr>
+          <w:rStyle w:val="NormalTok"/>
+        </w:rPr>
+        <w:t xml:space="preserve">) </w:t>
+      </w:r>
+      <w:r>
+        <w:rPr>
+          <w:rStyle w:val="SpecialCharTok"/>
+        </w:rPr>
+        <w:t xml:space="preserve">|&gt;</w:t>
+      </w:r>
+      <w:r>
+        <w:br/>
+      </w:r>
+      <w:r>
+        <w:rPr>
+          <w:rStyle w:val="NormalTok"/>
+        </w:rPr>
+        <w:t xml:space="preserve">  </w:t>
+      </w:r>
+      <w:r>
+        <w:rPr>
+          <w:rStyle w:val="FunctionTok"/>
+        </w:rPr>
+        <w:t xml:space="preserve">rename</w:t>
+      </w:r>
+      <w:r>
+        <w:rPr>
+          <w:rStyle w:val="NormalTok"/>
+        </w:rPr>
+        <w:t xml:space="preserve">(</w:t>
+      </w:r>
+      <w:r>
+        <w:rPr>
+          <w:rStyle w:val="StringTok"/>
+        </w:rPr>
+        <w:t xml:space="preserve">"Characteristics"</w:t>
+      </w:r>
+      <w:r>
+        <w:rPr>
+          <w:rStyle w:val="NormalTok"/>
+        </w:rPr>
+        <w:t xml:space="preserve"> </w:t>
+      </w:r>
+      <w:r>
+        <w:rPr>
+          <w:rStyle w:val="OtherTok"/>
+        </w:rPr>
+        <w:t xml:space="preserve">=</w:t>
+      </w:r>
+      <w:r>
+        <w:rPr>
+          <w:rStyle w:val="NormalTok"/>
+        </w:rPr>
+        <w:t xml:space="preserve"> datamart)</w:t>
+      </w:r>
+    </w:p>
+    <w:p>
+      <w:pPr>
+        <w:pStyle w:val="SourceCode"/>
+      </w:pPr>
+      <w:r>
+        <w:rPr>
+          <w:rStyle w:val="VerbatimChar"/>
+        </w:rPr>
+        <w:t xml:space="preserve">New names:</w:t>
+      </w:r>
+      <w:r>
+        <w:br/>
+      </w:r>
+      <w:r>
+        <w:rPr>
+          <w:rStyle w:val="VerbatimChar"/>
+        </w:rPr>
+        <w:t xml:space="preserve">• `` -&gt; `...3`</w:t>
+      </w:r>
+      <w:r>
+        <w:br/>
+      </w:r>
+      <w:r>
+        <w:rPr>
+          <w:rStyle w:val="VerbatimChar"/>
+        </w:rPr>
+        <w:t xml:space="preserve">• `` -&gt; `...8`</w:t>
+      </w:r>
+      <w:r>
+        <w:br/>
+      </w:r>
+      <w:r>
+        <w:rPr>
+          <w:rStyle w:val="VerbatimChar"/>
+        </w:rPr>
+        <w:t xml:space="preserve">• `` -&gt; `...10`</w:t>
+      </w:r>
+    </w:p>
+    <w:p>
+      <w:pPr>
+        <w:pStyle w:val="SourceCode"/>
+      </w:pPr>
+      <w:r>
+        <w:rPr>
+          <w:rStyle w:val="NormalTok"/>
+        </w:rPr>
+        <w:t xml:space="preserve">sites </w:t>
+      </w:r>
+      <w:r>
+        <w:rPr>
+          <w:rStyle w:val="OtherTok"/>
+        </w:rPr>
+        <w:t xml:space="preserve">&lt;-</w:t>
+      </w:r>
+      <w:r>
+        <w:rPr>
+          <w:rStyle w:val="NormalTok"/>
+        </w:rPr>
+        <w:t xml:space="preserve"> </w:t>
+      </w:r>
+      <w:r>
+        <w:rPr>
+          <w:rStyle w:val="FunctionTok"/>
+        </w:rPr>
+        <w:t xml:space="preserve">read_xlsx</w:t>
+      </w:r>
+      <w:r>
+        <w:rPr>
+          <w:rStyle w:val="NormalTok"/>
+        </w:rPr>
+        <w:t xml:space="preserve">(</w:t>
+      </w:r>
+      <w:r>
+        <w:rPr>
+          <w:rStyle w:val="StringTok"/>
+        </w:rPr>
+        <w:t xml:space="preserve">"FD2396_anonymous_datamart_id_crosswalk.xlsx"</w:t>
+      </w:r>
+      <w:r>
+        <w:rPr>
+          <w:rStyle w:val="NormalTok"/>
+        </w:rPr>
+        <w:t xml:space="preserve">) </w:t>
+      </w:r>
+      <w:r>
+        <w:rPr>
+          <w:rStyle w:val="SpecialCharTok"/>
+        </w:rPr>
+        <w:t xml:space="preserve">%&gt;%</w:t>
+      </w:r>
+      <w:r>
+        <w:br/>
+      </w:r>
+      <w:r>
+        <w:rPr>
+          <w:rStyle w:val="NormalTok"/>
+        </w:rPr>
+        <w:t xml:space="preserve">  </w:t>
+      </w:r>
+      <w:r>
+        <w:rPr>
+          <w:rStyle w:val="FunctionTok"/>
+        </w:rPr>
+        <w:t xml:space="preserve">clean_names</w:t>
+      </w:r>
+      <w:r>
+        <w:rPr>
+          <w:rStyle w:val="NormalTok"/>
+        </w:rPr>
+        <w:t xml:space="preserve">() </w:t>
+      </w:r>
+      <w:r>
+        <w:rPr>
+          <w:rStyle w:val="SpecialCharTok"/>
+        </w:rPr>
+        <w:t xml:space="preserve">%&gt;%</w:t>
+      </w:r>
+      <w:r>
+        <w:br/>
+      </w:r>
+      <w:r>
+        <w:rPr>
+          <w:rStyle w:val="NormalTok"/>
+        </w:rPr>
+        <w:t xml:space="preserve">  </w:t>
+      </w:r>
+      <w:r>
+        <w:rPr>
+          <w:rStyle w:val="FunctionTok"/>
+        </w:rPr>
+        <w:t xml:space="preserve">select</w:t>
+      </w:r>
+      <w:r>
+        <w:rPr>
+          <w:rStyle w:val="NormalTok"/>
+        </w:rPr>
+        <w:t xml:space="preserve">(</w:t>
+      </w:r>
+      <w:r>
+        <w:rPr>
+          <w:rStyle w:val="DecValTok"/>
+        </w:rPr>
+        <w:t xml:space="preserve">2</w:t>
+      </w:r>
+      <w:r>
+        <w:rPr>
+          <w:rStyle w:val="NormalTok"/>
+        </w:rPr>
+        <w:t xml:space="preserve">,</w:t>
+      </w:r>
+      <w:r>
+        <w:rPr>
+          <w:rStyle w:val="DecValTok"/>
+        </w:rPr>
+        <w:t xml:space="preserve">5</w:t>
+      </w:r>
+      <w:r>
+        <w:rPr>
+          <w:rStyle w:val="NormalTok"/>
+        </w:rPr>
+        <w:t xml:space="preserve">,</w:t>
+      </w:r>
+      <w:r>
+        <w:rPr>
+          <w:rStyle w:val="DecValTok"/>
+        </w:rPr>
+        <w:t xml:space="preserve">7</w:t>
+      </w:r>
+      <w:r>
+        <w:rPr>
+          <w:rStyle w:val="NormalTok"/>
+        </w:rPr>
+        <w:t xml:space="preserve">) </w:t>
+      </w:r>
+      <w:r>
+        <w:rPr>
+          <w:rStyle w:val="SpecialCharTok"/>
+        </w:rPr>
+        <w:t xml:space="preserve">%&gt;%</w:t>
+      </w:r>
+      <w:r>
+        <w:br/>
+      </w:r>
+      <w:r>
+        <w:rPr>
+          <w:rStyle w:val="NormalTok"/>
+        </w:rPr>
+        <w:t xml:space="preserve">  </w:t>
+      </w:r>
+      <w:r>
+        <w:rPr>
+          <w:rStyle w:val="FunctionTok"/>
+        </w:rPr>
+        <w:t xml:space="preserve">rename</w:t>
+      </w:r>
+      <w:r>
+        <w:rPr>
+          <w:rStyle w:val="NormalTok"/>
+        </w:rPr>
+        <w:t xml:space="preserve">(</w:t>
+      </w:r>
+      <w:r>
+        <w:rPr>
+          <w:rStyle w:val="AttributeTok"/>
+        </w:rPr>
+        <w:t xml:space="preserve">datamart =</w:t>
+      </w:r>
+      <w:r>
+        <w:rPr>
+          <w:rStyle w:val="NormalTok"/>
+        </w:rPr>
+        <w:t xml:space="preserve"> anonymous_datamart_id,</w:t>
+      </w:r>
+      <w:r>
+        <w:br/>
+      </w:r>
+      <w:r>
+        <w:rPr>
+          <w:rStyle w:val="NormalTok"/>
+        </w:rPr>
+        <w:t xml:space="preserve">         </w:t>
+      </w:r>
+      <w:r>
+        <w:rPr>
+          <w:rStyle w:val="AttributeTok"/>
+        </w:rPr>
+        <w:t xml:space="preserve">network =</w:t>
+      </w:r>
+      <w:r>
+        <w:rPr>
+          <w:rStyle w:val="NormalTok"/>
+        </w:rPr>
+        <w:t xml:space="preserve"> network_name,</w:t>
+      </w:r>
+      <w:r>
+        <w:br/>
+      </w:r>
+      <w:r>
+        <w:rPr>
+          <w:rStyle w:val="NormalTok"/>
+        </w:rPr>
+        <w:t xml:space="preserve">         </w:t>
+      </w:r>
+      <w:r>
+        <w:rPr>
+          <w:rStyle w:val="AttributeTok"/>
+        </w:rPr>
+        <w:t xml:space="preserve">site =</w:t>
+      </w:r>
+      <w:r>
+        <w:rPr>
+          <w:rStyle w:val="NormalTok"/>
+        </w:rPr>
+        <w:t xml:space="preserve"> datamart_name) </w:t>
+      </w:r>
+      <w:r>
+        <w:rPr>
+          <w:rStyle w:val="SpecialCharTok"/>
+        </w:rPr>
+        <w:t xml:space="preserve">|&gt;</w:t>
+      </w:r>
+      <w:r>
+        <w:br/>
+      </w:r>
+      <w:r>
+        <w:rPr>
+          <w:rStyle w:val="NormalTok"/>
+        </w:rPr>
+        <w:t xml:space="preserve">  </w:t>
+      </w:r>
+      <w:r>
+        <w:rPr>
+          <w:rStyle w:val="FunctionTok"/>
+        </w:rPr>
+        <w:t xml:space="preserve">slice</w:t>
+      </w:r>
+      <w:r>
+        <w:rPr>
+          <w:rStyle w:val="NormalTok"/>
+        </w:rPr>
+        <w:t xml:space="preserve">(</w:t>
+      </w:r>
+      <w:r>
+        <w:rPr>
+          <w:rStyle w:val="DecValTok"/>
+        </w:rPr>
+        <w:t xml:space="preserve">1</w:t>
+      </w:r>
+      <w:r>
+        <w:rPr>
+          <w:rStyle w:val="SpecialCharTok"/>
+        </w:rPr>
+        <w:t xml:space="preserve">:</w:t>
+      </w:r>
+      <w:r>
+        <w:rPr>
+          <w:rStyle w:val="DecValTok"/>
+        </w:rPr>
+        <w:t xml:space="preserve">62</w:t>
+      </w:r>
+      <w:r>
+        <w:rPr>
+          <w:rStyle w:val="NormalTok"/>
+        </w:rPr>
+        <w:t xml:space="preserve">)</w:t>
+      </w:r>
+    </w:p>
+    <w:p>
+      <w:pPr>
+        <w:pStyle w:val="SourceCode"/>
+      </w:pPr>
+      <w:r>
+        <w:rPr>
+          <w:rStyle w:val="VerbatimChar"/>
+        </w:rPr>
+        <w:t xml:space="preserve">New names:</w:t>
+      </w:r>
+      <w:r>
+        <w:br/>
+      </w:r>
+      <w:r>
+        <w:rPr>
+          <w:rStyle w:val="VerbatimChar"/>
+        </w:rPr>
+        <w:t xml:space="preserve">• `` -&gt; `...3`</w:t>
+      </w:r>
+      <w:r>
+        <w:br/>
+      </w:r>
+      <w:r>
+        <w:rPr>
+          <w:rStyle w:val="VerbatimChar"/>
+        </w:rPr>
+        <w:t xml:space="preserve">• `` -&gt; `...8`</w:t>
+      </w:r>
+      <w:r>
+        <w:br/>
+      </w:r>
+      <w:r>
+        <w:rPr>
+          <w:rStyle w:val="VerbatimChar"/>
+        </w:rPr>
+        <w:t xml:space="preserve">• `` -&gt; `...10`</w:t>
+      </w:r>
+    </w:p>
+    <w:p>
+      <w:pPr>
+        <w:pStyle w:val="SourceCode"/>
+      </w:pPr>
+      <w:r>
+        <w:rPr>
+          <w:rStyle w:val="NormalTok"/>
+        </w:rPr>
+        <w:t xml:space="preserve">merged </w:t>
+      </w:r>
+      <w:r>
+        <w:rPr>
+          <w:rStyle w:val="OtherTok"/>
+        </w:rPr>
+        <w:t xml:space="preserve">&lt;-</w:t>
+      </w:r>
+      <w:r>
+        <w:rPr>
+          <w:rStyle w:val="NormalTok"/>
+        </w:rPr>
+        <w:t xml:space="preserve"> </w:t>
+      </w:r>
+      <w:r>
+        <w:rPr>
+          <w:rStyle w:val="FunctionTok"/>
+        </w:rPr>
+        <w:t xml:space="preserve">bind_rows</w:t>
+      </w:r>
+      <w:r>
+        <w:rPr>
+          <w:rStyle w:val="NormalTok"/>
+        </w:rPr>
+        <w:t xml:space="preserve">(ann_dat, crosswalk)  </w:t>
+      </w:r>
+      <w:r>
+        <w:br/>
+      </w:r>
+      <w:r>
+        <w:rPr>
+          <w:rStyle w:val="NormalTok"/>
+        </w:rPr>
+        <w:t xml:space="preserve">merged</w:t>
+      </w:r>
+      <w:r>
+        <w:rPr>
+          <w:rStyle w:val="SpecialCharTok"/>
+        </w:rPr>
+        <w:t xml:space="preserve">$</w:t>
+      </w:r>
+      <w:r>
+        <w:rPr>
+          <w:rStyle w:val="NormalTok"/>
+        </w:rPr>
+        <w:t xml:space="preserve">Characteris[</w:t>
+      </w:r>
+      <w:r>
+        <w:rPr>
+          <w:rStyle w:val="DecValTok"/>
+        </w:rPr>
+        <w:t xml:space="preserve">76</w:t>
+      </w:r>
+      <w:r>
+        <w:rPr>
+          <w:rStyle w:val="NormalTok"/>
+        </w:rPr>
+        <w:t xml:space="preserve">] </w:t>
+      </w:r>
+      <w:r>
+        <w:rPr>
+          <w:rStyle w:val="OtherTok"/>
+        </w:rPr>
+        <w:t xml:space="preserve">&lt;-</w:t>
+      </w:r>
+      <w:r>
+        <w:rPr>
+          <w:rStyle w:val="NormalTok"/>
+        </w:rPr>
+        <w:t xml:space="preserve"> </w:t>
+      </w:r>
+      <w:r>
+        <w:rPr>
+          <w:rStyle w:val="StringTok"/>
+        </w:rPr>
+        <w:t xml:space="preserve">'Network'</w:t>
+      </w:r>
+      <w:r>
+        <w:br/>
+      </w:r>
+      <w:r>
+        <w:rPr>
+          <w:rStyle w:val="NormalTok"/>
+        </w:rPr>
+        <w:t xml:space="preserve">merged</w:t>
+      </w:r>
+      <w:r>
+        <w:rPr>
+          <w:rStyle w:val="SpecialCharTok"/>
+        </w:rPr>
+        <w:t xml:space="preserve">$</w:t>
+      </w:r>
+      <w:r>
+        <w:rPr>
+          <w:rStyle w:val="NormalTok"/>
+        </w:rPr>
+        <w:t xml:space="preserve">Characteris[</w:t>
+      </w:r>
+      <w:r>
+        <w:rPr>
+          <w:rStyle w:val="DecValTok"/>
+        </w:rPr>
+        <w:t xml:space="preserve">77</w:t>
+      </w:r>
+      <w:r>
+        <w:rPr>
+          <w:rStyle w:val="NormalTok"/>
+        </w:rPr>
+        <w:t xml:space="preserve">] </w:t>
+      </w:r>
+      <w:r>
+        <w:rPr>
+          <w:rStyle w:val="OtherTok"/>
+        </w:rPr>
+        <w:t xml:space="preserve">&lt;-</w:t>
+      </w:r>
+      <w:r>
+        <w:rPr>
+          <w:rStyle w:val="NormalTok"/>
+        </w:rPr>
+        <w:t xml:space="preserve"> </w:t>
+      </w:r>
+      <w:r>
+        <w:rPr>
+          <w:rStyle w:val="StringTok"/>
+        </w:rPr>
+        <w:t xml:space="preserve">'site'</w:t>
+      </w:r>
+      <w:r>
+        <w:br/>
+      </w:r>
+      <w:r>
+        <w:br/>
+      </w:r>
+      <w:r>
+        <w:br/>
+      </w:r>
+      <w:r>
+        <w:br/>
+      </w:r>
+      <w:r>
+        <w:rPr>
+          <w:rStyle w:val="NormalTok"/>
+        </w:rPr>
+        <w:t xml:space="preserve">tall </w:t>
+      </w:r>
+      <w:r>
+        <w:rPr>
+          <w:rStyle w:val="OtherTok"/>
+        </w:rPr>
+        <w:t xml:space="preserve">&lt;-</w:t>
+      </w:r>
+      <w:r>
+        <w:rPr>
+          <w:rStyle w:val="NormalTok"/>
+        </w:rPr>
+        <w:t xml:space="preserve"> merged</w:t>
+      </w:r>
+      <w:r>
+        <w:rPr>
+          <w:rStyle w:val="SpecialCharTok"/>
+        </w:rPr>
+        <w:t xml:space="preserve">|&gt;</w:t>
+      </w:r>
+      <w:r>
+        <w:br/>
+      </w:r>
+      <w:r>
+        <w:rPr>
+          <w:rStyle w:val="NormalTok"/>
+        </w:rPr>
+        <w:t xml:space="preserve">  </w:t>
+      </w:r>
+      <w:r>
+        <w:rPr>
+          <w:rStyle w:val="FunctionTok"/>
+        </w:rPr>
+        <w:t xml:space="preserve">slice</w:t>
+      </w:r>
+      <w:r>
+        <w:rPr>
+          <w:rStyle w:val="NormalTok"/>
+        </w:rPr>
+        <w:t xml:space="preserve">(</w:t>
+      </w:r>
+      <w:r>
+        <w:rPr>
+          <w:rStyle w:val="DecValTok"/>
+        </w:rPr>
+        <w:t xml:space="preserve">1</w:t>
+      </w:r>
+      <w:r>
+        <w:rPr>
+          <w:rStyle w:val="NormalTok"/>
+        </w:rPr>
+        <w:t xml:space="preserve">, </w:t>
+      </w:r>
+      <w:r>
+        <w:rPr>
+          <w:rStyle w:val="DecValTok"/>
+        </w:rPr>
+        <w:t xml:space="preserve">77</w:t>
+      </w:r>
+      <w:r>
+        <w:rPr>
+          <w:rStyle w:val="NormalTok"/>
+        </w:rPr>
+        <w:t xml:space="preserve">) </w:t>
+      </w:r>
+      <w:r>
+        <w:rPr>
+          <w:rStyle w:val="SpecialCharTok"/>
+        </w:rPr>
+        <w:t xml:space="preserve">|&gt;</w:t>
+      </w:r>
+      <w:r>
+        <w:br/>
+      </w:r>
+      <w:r>
+        <w:rPr>
+          <w:rStyle w:val="NormalTok"/>
+        </w:rPr>
+        <w:t xml:space="preserve">  </w:t>
+      </w:r>
+      <w:r>
+        <w:rPr>
+          <w:rStyle w:val="FunctionTok"/>
+        </w:rPr>
+        <w:t xml:space="preserve">pivot_longer</w:t>
+      </w:r>
+      <w:r>
+        <w:rPr>
+          <w:rStyle w:val="NormalTok"/>
+        </w:rPr>
+        <w:t xml:space="preserve">(</w:t>
+      </w:r>
+      <w:r>
+        <w:rPr>
+          <w:rStyle w:val="AttributeTok"/>
+        </w:rPr>
+        <w:t xml:space="preserve">cols =</w:t>
+      </w:r>
+      <w:r>
+        <w:rPr>
+          <w:rStyle w:val="NormalTok"/>
+        </w:rPr>
+        <w:t xml:space="preserve"> </w:t>
+      </w:r>
+      <w:r>
+        <w:rPr>
+          <w:rStyle w:val="SpecialCharTok"/>
+        </w:rPr>
+        <w:t xml:space="preserve">-</w:t>
+      </w:r>
+      <w:r>
+        <w:rPr>
+          <w:rStyle w:val="NormalTok"/>
+        </w:rPr>
+        <w:t xml:space="preserve">Characteris, </w:t>
+      </w:r>
+      <w:r>
+        <w:rPr>
+          <w:rStyle w:val="AttributeTok"/>
+        </w:rPr>
+        <w:t xml:space="preserve">names_to =</w:t>
+      </w:r>
+      <w:r>
+        <w:rPr>
+          <w:rStyle w:val="NormalTok"/>
+        </w:rPr>
+        <w:t xml:space="preserve"> </w:t>
+      </w:r>
+      <w:r>
+        <w:rPr>
+          <w:rStyle w:val="StringTok"/>
+        </w:rPr>
+        <w:t xml:space="preserve">"datamart"</w:t>
+      </w:r>
+      <w:r>
+        <w:rPr>
+          <w:rStyle w:val="NormalTok"/>
+        </w:rPr>
+        <w:t xml:space="preserve">, </w:t>
+      </w:r>
+      <w:r>
+        <w:rPr>
+          <w:rStyle w:val="AttributeTok"/>
+        </w:rPr>
+        <w:t xml:space="preserve">values_to =</w:t>
+      </w:r>
+      <w:r>
+        <w:rPr>
+          <w:rStyle w:val="NormalTok"/>
+        </w:rPr>
+        <w:t xml:space="preserve"> </w:t>
+      </w:r>
+      <w:r>
+        <w:rPr>
+          <w:rStyle w:val="StringTok"/>
+        </w:rPr>
+        <w:t xml:space="preserve">"count"</w:t>
+      </w:r>
+      <w:r>
+        <w:rPr>
+          <w:rStyle w:val="NormalTok"/>
+        </w:rPr>
+        <w:t xml:space="preserve">)</w:t>
+      </w:r>
+      <w:r>
+        <w:br/>
+      </w:r>
+      <w:r>
+        <w:br/>
+      </w:r>
+      <w:r>
+        <w:br/>
+      </w:r>
+      <w:r>
+        <w:rPr>
+          <w:rStyle w:val="NormalTok"/>
+        </w:rPr>
+        <w:t xml:space="preserve">site_count </w:t>
+      </w:r>
+      <w:r>
+        <w:rPr>
+          <w:rStyle w:val="OtherTok"/>
+        </w:rPr>
+        <w:t xml:space="preserve">&lt;-</w:t>
+      </w:r>
+      <w:r>
+        <w:rPr>
+          <w:rStyle w:val="NormalTok"/>
+        </w:rPr>
+        <w:t xml:space="preserve"> </w:t>
+      </w:r>
+      <w:r>
+        <w:rPr>
+          <w:rStyle w:val="FunctionTok"/>
+        </w:rPr>
+        <w:t xml:space="preserve">left_join</w:t>
+      </w:r>
+      <w:r>
+        <w:rPr>
+          <w:rStyle w:val="NormalTok"/>
+        </w:rPr>
+        <w:t xml:space="preserve">(tall, sites) </w:t>
+      </w:r>
+      <w:r>
+        <w:rPr>
+          <w:rStyle w:val="SpecialCharTok"/>
+        </w:rPr>
+        <w:t xml:space="preserve">|&gt;</w:t>
+      </w:r>
+      <w:r>
+        <w:br/>
+      </w:r>
+      <w:r>
+        <w:rPr>
+          <w:rStyle w:val="NormalTok"/>
+        </w:rPr>
+        <w:t xml:space="preserve">  </w:t>
+      </w:r>
+      <w:r>
+        <w:rPr>
+          <w:rStyle w:val="FunctionTok"/>
+        </w:rPr>
+        <w:t xml:space="preserve">slice</w:t>
+      </w:r>
+      <w:r>
+        <w:rPr>
+          <w:rStyle w:val="NormalTok"/>
+        </w:rPr>
+        <w:t xml:space="preserve">(</w:t>
+      </w:r>
+      <w:r>
+        <w:rPr>
+          <w:rStyle w:val="DecValTok"/>
+        </w:rPr>
+        <w:t xml:space="preserve">1</w:t>
+      </w:r>
+      <w:r>
+        <w:rPr>
+          <w:rStyle w:val="SpecialCharTok"/>
+        </w:rPr>
+        <w:t xml:space="preserve">:</w:t>
+      </w:r>
+      <w:r>
+        <w:rPr>
+          <w:rStyle w:val="DecValTok"/>
+        </w:rPr>
+        <w:t xml:space="preserve">62</w:t>
+      </w:r>
+      <w:r>
+        <w:rPr>
+          <w:rStyle w:val="NormalTok"/>
+        </w:rPr>
+        <w:t xml:space="preserve">) </w:t>
+      </w:r>
+      <w:r>
+        <w:rPr>
+          <w:rStyle w:val="SpecialCharTok"/>
+        </w:rPr>
+        <w:t xml:space="preserve">|&gt;</w:t>
+      </w:r>
+      <w:r>
+        <w:br/>
+      </w:r>
+      <w:r>
+        <w:rPr>
+          <w:rStyle w:val="NormalTok"/>
+        </w:rPr>
+        <w:t xml:space="preserve">  </w:t>
+      </w:r>
+      <w:r>
+        <w:rPr>
+          <w:rStyle w:val="FunctionTok"/>
+        </w:rPr>
+        <w:t xml:space="preserve">mutate</w:t>
+      </w:r>
+      <w:r>
+        <w:rPr>
+          <w:rStyle w:val="NormalTok"/>
+        </w:rPr>
+        <w:t xml:space="preserve">(</w:t>
+      </w:r>
+      <w:r>
+        <w:rPr>
+          <w:rStyle w:val="AttributeTok"/>
+        </w:rPr>
+        <w:t xml:space="preserve">count =</w:t>
+      </w:r>
+      <w:r>
+        <w:rPr>
+          <w:rStyle w:val="NormalTok"/>
+        </w:rPr>
+        <w:t xml:space="preserve"> </w:t>
+      </w:r>
+      <w:r>
+        <w:rPr>
+          <w:rStyle w:val="FunctionTok"/>
+        </w:rPr>
+        <w:t xml:space="preserve">as.numeric</w:t>
+      </w:r>
+      <w:r>
+        <w:rPr>
+          <w:rStyle w:val="NormalTok"/>
+        </w:rPr>
+        <w:t xml:space="preserve">(count)) </w:t>
+      </w:r>
+      <w:r>
+        <w:rPr>
+          <w:rStyle w:val="SpecialCharTok"/>
+        </w:rPr>
+        <w:t xml:space="preserve">|&gt;</w:t>
+      </w:r>
+      <w:r>
+        <w:br/>
+      </w:r>
+      <w:r>
+        <w:rPr>
+          <w:rStyle w:val="NormalTok"/>
+        </w:rPr>
+        <w:t xml:space="preserve">  </w:t>
+      </w:r>
+      <w:r>
+        <w:rPr>
+          <w:rStyle w:val="FunctionTok"/>
+        </w:rPr>
+        <w:t xml:space="preserve">arrange</w:t>
+      </w:r>
+      <w:r>
+        <w:rPr>
+          <w:rStyle w:val="NormalTok"/>
+        </w:rPr>
+        <w:t xml:space="preserve">(</w:t>
+      </w:r>
+      <w:r>
+        <w:rPr>
+          <w:rStyle w:val="FunctionTok"/>
+        </w:rPr>
+        <w:t xml:space="preserve">desc</w:t>
+      </w:r>
+      <w:r>
+        <w:rPr>
+          <w:rStyle w:val="NormalTok"/>
+        </w:rPr>
+        <w:t xml:space="preserve">(count))</w:t>
+      </w:r>
+    </w:p>
+    <w:p>
+      <w:pPr>
+        <w:pStyle w:val="SourceCode"/>
+      </w:pPr>
+      <w:r>
+        <w:rPr>
+          <w:rStyle w:val="VerbatimChar"/>
+        </w:rPr>
+        <w:t xml:space="preserve">Joining with `by = join_by(datamart)`</w:t>
+      </w:r>
+    </w:p>
+    <w:p>
+      <w:pPr>
+        <w:pStyle w:val="SourceCode"/>
+      </w:pPr>
+      <w:r>
+        <w:rPr>
+          <w:rStyle w:val="VerbatimChar"/>
+        </w:rPr>
+        <w:t xml:space="preserve">Warning: There was 1 warning in `mutate()`.</w:t>
+      </w:r>
+      <w:r>
+        <w:br/>
+      </w:r>
+      <w:r>
+        <w:rPr>
+          <w:rStyle w:val="VerbatimChar"/>
+        </w:rPr>
+        <w:t xml:space="preserve">ℹ In argument: `count = as.numeric(count)`.</w:t>
+      </w:r>
+      <w:r>
+        <w:br/>
+      </w:r>
+      <w:r>
+        <w:rPr>
+          <w:rStyle w:val="VerbatimChar"/>
+        </w:rPr>
+        <w:t xml:space="preserve">Caused by warning:</w:t>
+      </w:r>
+      <w:r>
+        <w:br/>
+      </w:r>
+      <w:r>
+        <w:rPr>
+          <w:rStyle w:val="VerbatimChar"/>
+        </w:rPr>
+        <w:t xml:space="preserve">! NAs introduced by coercion</w:t>
+      </w:r>
+    </w:p>
+    <w:p>
+      <w:pPr>
+        <w:pStyle w:val="SourceCode"/>
+      </w:pPr>
+      <w:r>
+        <w:rPr>
+          <w:rStyle w:val="NormalTok"/>
+        </w:rPr>
+        <w:t xml:space="preserve">site_count </w:t>
+      </w:r>
+      <w:r>
+        <w:rPr>
+          <w:rStyle w:val="SpecialCharTok"/>
+        </w:rPr>
+        <w:t xml:space="preserve">|&gt;</w:t>
+      </w:r>
+      <w:r>
+        <w:br/>
+      </w:r>
+      <w:r>
+        <w:rPr>
+          <w:rStyle w:val="NormalTok"/>
+        </w:rPr>
+        <w:t xml:space="preserve">  </w:t>
+      </w:r>
+      <w:r>
+        <w:rPr>
+          <w:rStyle w:val="FunctionTok"/>
+        </w:rPr>
+        <w:t xml:space="preserve">filter</w:t>
+      </w:r>
+      <w:r>
+        <w:rPr>
+          <w:rStyle w:val="NormalTok"/>
+        </w:rPr>
+        <w:t xml:space="preserve">(</w:t>
+      </w:r>
+      <w:r>
+        <w:rPr>
+          <w:rStyle w:val="SpecialCharTok"/>
+        </w:rPr>
+        <w:t xml:space="preserve">!</w:t>
+      </w:r>
+      <w:r>
+        <w:rPr>
+          <w:rStyle w:val="FunctionTok"/>
+        </w:rPr>
+        <w:t xml:space="preserve">is.na</w:t>
+      </w:r>
+      <w:r>
+        <w:rPr>
+          <w:rStyle w:val="NormalTok"/>
+        </w:rPr>
+        <w:t xml:space="preserve">(count)) </w:t>
+      </w:r>
+      <w:r>
+        <w:rPr>
+          <w:rStyle w:val="SpecialCharTok"/>
+        </w:rPr>
+        <w:t xml:space="preserve">|&gt;</w:t>
+      </w:r>
+      <w:r>
+        <w:br/>
+      </w:r>
+      <w:r>
+        <w:rPr>
+          <w:rStyle w:val="NormalTok"/>
+        </w:rPr>
+        <w:t xml:space="preserve">  </w:t>
+      </w:r>
+      <w:r>
+        <w:rPr>
+          <w:rStyle w:val="FunctionTok"/>
+        </w:rPr>
+        <w:t xml:space="preserve">ggplot</w:t>
+      </w:r>
+      <w:r>
+        <w:rPr>
+          <w:rStyle w:val="NormalTok"/>
+        </w:rPr>
+        <w:t xml:space="preserve">(</w:t>
+      </w:r>
+      <w:r>
+        <w:rPr>
+          <w:rStyle w:val="FunctionTok"/>
+        </w:rPr>
+        <w:t xml:space="preserve">aes</w:t>
+      </w:r>
+      <w:r>
+        <w:rPr>
+          <w:rStyle w:val="NormalTok"/>
+        </w:rPr>
+        <w:t xml:space="preserve">(</w:t>
+      </w:r>
+      <w:r>
+        <w:rPr>
+          <w:rStyle w:val="AttributeTok"/>
+        </w:rPr>
+        <w:t xml:space="preserve">y =</w:t>
+      </w:r>
+      <w:r>
+        <w:rPr>
+          <w:rStyle w:val="NormalTok"/>
+        </w:rPr>
+        <w:t xml:space="preserve"> count, </w:t>
+      </w:r>
+      <w:r>
+        <w:rPr>
+          <w:rStyle w:val="AttributeTok"/>
+        </w:rPr>
+        <w:t xml:space="preserve">x =</w:t>
+      </w:r>
+      <w:r>
+        <w:rPr>
+          <w:rStyle w:val="NormalTok"/>
+        </w:rPr>
+        <w:t xml:space="preserve"> </w:t>
+      </w:r>
+      <w:r>
+        <w:rPr>
+          <w:rStyle w:val="FunctionTok"/>
+        </w:rPr>
+        <w:t xml:space="preserve">reorder</w:t>
+      </w:r>
+      <w:r>
+        <w:rPr>
+          <w:rStyle w:val="NormalTok"/>
+        </w:rPr>
+        <w:t xml:space="preserve">(site, count), </w:t>
+      </w:r>
+      <w:r>
+        <w:rPr>
+          <w:rStyle w:val="AttributeTok"/>
+        </w:rPr>
+        <w:t xml:space="preserve">fill =</w:t>
+      </w:r>
+      <w:r>
+        <w:rPr>
+          <w:rStyle w:val="NormalTok"/>
+        </w:rPr>
+        <w:t xml:space="preserve"> network)) </w:t>
+      </w:r>
+      <w:r>
+        <w:rPr>
+          <w:rStyle w:val="SpecialCharTok"/>
+        </w:rPr>
+        <w:t xml:space="preserve">+</w:t>
+      </w:r>
+      <w:r>
+        <w:br/>
+      </w:r>
+      <w:r>
+        <w:rPr>
+          <w:rStyle w:val="NormalTok"/>
+        </w:rPr>
+        <w:t xml:space="preserve">  </w:t>
+      </w:r>
+      <w:r>
+        <w:rPr>
+          <w:rStyle w:val="FunctionTok"/>
+        </w:rPr>
+        <w:t xml:space="preserve">geom_bar</w:t>
+      </w:r>
+      <w:r>
+        <w:rPr>
+          <w:rStyle w:val="NormalTok"/>
+        </w:rPr>
+        <w:t xml:space="preserve">(</w:t>
+      </w:r>
+      <w:r>
+        <w:rPr>
+          <w:rStyle w:val="AttributeTok"/>
+        </w:rPr>
+        <w:t xml:space="preserve">stat =</w:t>
+      </w:r>
+      <w:r>
+        <w:rPr>
+          <w:rStyle w:val="NormalTok"/>
+        </w:rPr>
+        <w:t xml:space="preserve"> </w:t>
+      </w:r>
+      <w:r>
+        <w:rPr>
+          <w:rStyle w:val="StringTok"/>
+        </w:rPr>
+        <w:t xml:space="preserve">"identity"</w:t>
+      </w:r>
+      <w:r>
+        <w:rPr>
+          <w:rStyle w:val="NormalTok"/>
+        </w:rPr>
+        <w:t xml:space="preserve">) </w:t>
+      </w:r>
+      <w:r>
+        <w:rPr>
+          <w:rStyle w:val="SpecialCharTok"/>
+        </w:rPr>
+        <w:t xml:space="preserve">+</w:t>
+      </w:r>
+      <w:r>
+        <w:br/>
+      </w:r>
+      <w:r>
+        <w:rPr>
+          <w:rStyle w:val="NormalTok"/>
+        </w:rPr>
+        <w:t xml:space="preserve">  </w:t>
+      </w:r>
+      <w:r>
+        <w:rPr>
+          <w:rStyle w:val="FunctionTok"/>
+        </w:rPr>
+        <w:t xml:space="preserve">labs</w:t>
+      </w:r>
+      <w:r>
+        <w:rPr>
+          <w:rStyle w:val="NormalTok"/>
+        </w:rPr>
+        <w:t xml:space="preserve">(</w:t>
+      </w:r>
+      <w:r>
+        <w:rPr>
+          <w:rStyle w:val="AttributeTok"/>
+        </w:rPr>
+        <w:t xml:space="preserve">title =</w:t>
+      </w:r>
+      <w:r>
+        <w:rPr>
+          <w:rStyle w:val="NormalTok"/>
+        </w:rPr>
+        <w:t xml:space="preserve"> </w:t>
+      </w:r>
+      <w:r>
+        <w:rPr>
+          <w:rStyle w:val="StringTok"/>
+        </w:rPr>
+        <w:t xml:space="preserve">"Number of Unique ASUC Patients per Site in 2024"</w:t>
+      </w:r>
+      <w:r>
+        <w:rPr>
+          <w:rStyle w:val="NormalTok"/>
+        </w:rPr>
+        <w:t xml:space="preserve">,</w:t>
+      </w:r>
+      <w:r>
+        <w:br/>
+      </w:r>
+      <w:r>
+        <w:rPr>
+          <w:rStyle w:val="NormalTok"/>
+        </w:rPr>
+        <w:t xml:space="preserve">       </w:t>
+      </w:r>
+      <w:r>
+        <w:rPr>
+          <w:rStyle w:val="AttributeTok"/>
+        </w:rPr>
+        <w:t xml:space="preserve">x =</w:t>
+      </w:r>
+      <w:r>
+        <w:rPr>
+          <w:rStyle w:val="NormalTok"/>
+        </w:rPr>
+        <w:t xml:space="preserve"> </w:t>
+      </w:r>
+      <w:r>
+        <w:rPr>
+          <w:rStyle w:val="StringTok"/>
+        </w:rPr>
+        <w:t xml:space="preserve">"Number of Patients"</w:t>
+      </w:r>
+      <w:r>
+        <w:rPr>
+          <w:rStyle w:val="NormalTok"/>
+        </w:rPr>
+        <w:t xml:space="preserve">,</w:t>
+      </w:r>
+      <w:r>
+        <w:br/>
+      </w:r>
+      <w:r>
+        <w:rPr>
+          <w:rStyle w:val="NormalTok"/>
+        </w:rPr>
+        <w:t xml:space="preserve">       </w:t>
+      </w:r>
+      <w:r>
+        <w:rPr>
+          <w:rStyle w:val="AttributeTok"/>
+        </w:rPr>
+        <w:t xml:space="preserve">y =</w:t>
+      </w:r>
+      <w:r>
+        <w:rPr>
+          <w:rStyle w:val="NormalTok"/>
+        </w:rPr>
+        <w:t xml:space="preserve"> </w:t>
+      </w:r>
+      <w:r>
+        <w:rPr>
+          <w:rStyle w:val="StringTok"/>
+        </w:rPr>
+        <w:t xml:space="preserve">"Site"</w:t>
+      </w:r>
+      <w:r>
+        <w:rPr>
+          <w:rStyle w:val="NormalTok"/>
+        </w:rPr>
+        <w:t xml:space="preserve">) </w:t>
+      </w:r>
+      <w:r>
+        <w:rPr>
+          <w:rStyle w:val="SpecialCharTok"/>
+        </w:rPr>
+        <w:t xml:space="preserve">+</w:t>
+      </w:r>
+      <w:r>
+        <w:br/>
+      </w:r>
+      <w:r>
+        <w:rPr>
+          <w:rStyle w:val="NormalTok"/>
+        </w:rPr>
+        <w:t xml:space="preserve">  </w:t>
+      </w:r>
+      <w:r>
+        <w:rPr>
+          <w:rStyle w:val="FunctionTok"/>
+        </w:rPr>
+        <w:t xml:space="preserve">theme_minimal</w:t>
+      </w:r>
+      <w:r>
+        <w:rPr>
+          <w:rStyle w:val="NormalTok"/>
+        </w:rPr>
+        <w:t xml:space="preserve">() </w:t>
+      </w:r>
+      <w:r>
+        <w:rPr>
+          <w:rStyle w:val="SpecialCharTok"/>
+        </w:rPr>
+        <w:t xml:space="preserve">+</w:t>
+      </w:r>
+      <w:r>
+        <w:br/>
+      </w:r>
+      <w:r>
+        <w:rPr>
+          <w:rStyle w:val="NormalTok"/>
+        </w:rPr>
+        <w:t xml:space="preserve">  </w:t>
+      </w:r>
+      <w:r>
+        <w:rPr>
+          <w:rStyle w:val="FunctionTok"/>
+        </w:rPr>
+        <w:t xml:space="preserve">coord_flip</w:t>
+      </w:r>
+      <w:r>
+        <w:rPr>
+          <w:rStyle w:val="NormalTok"/>
+        </w:rPr>
+        <w:t xml:space="preserve">()</w:t>
+      </w:r>
+    </w:p>
+    <w:p>
+      <w:pPr>
+        <w:pStyle w:val="FirstParagraph"/>
+      </w:pPr>
+      <w:r>
+        <w:drawing>
+          <wp:inline>
+            <wp:extent cx="5334000" cy="4267200"/>
+            <wp:effectExtent b="0" l="0" r="0" t="0"/>
+            <wp:docPr descr="" title="" id="34" name="Picture"/>
+            <a:graphic>
+              <a:graphicData uri="http://schemas.openxmlformats.org/drawingml/2006/picture">
+                <pic:pic>
+                  <pic:nvPicPr>
+                    <pic:cNvPr descr="PCORI_QPR_files/figure-docx/unnamed-chunk-4-1.png" id="35" name="Picture"/>
+                    <pic:cNvPicPr>
+                      <a:picLocks noChangeArrowheads="1" noChangeAspect="1"/>
+                    </pic:cNvPicPr>
+                  </pic:nvPicPr>
+                  <pic:blipFill>
+                    <a:blip r:embed="rId33"/>
+                    <a:stretch>
+                      <a:fillRect/>
+                    </a:stretch>
+                  </pic:blipFill>
+                  <pic:spPr bwMode="auto">
+                    <a:xfrm>
+                      <a:off x="0" y="0"/>
+                      <a:ext cx="5334000" cy="4267200"/>
+                    </a:xfrm>
+                    <a:prstGeom prst="rect">
+                      <a:avLst/>
+                    </a:prstGeom>
+                    <a:noFill/>
+                    <a:ln w="9525">
+                      <a:noFill/>
+                      <a:headEnd/>
+                      <a:tailEnd/>
+                    </a:ln>
+                  </pic:spPr>
+                </pic:pic>
+              </a:graphicData>
+            </a:graphic>
+          </wp:inline>
+        </w:drawing>
+      </w:r>
+    </w:p>
+    <w:bookmarkEnd w:id="36"/>
+    <w:bookmarkEnd w:id="37"/>
     <w:sectPr>
       <w:footnotePr>
         <w:numRestart w:val="eachSect"/>

</xml_diff>